<commit_message>
Extend split suffix to remaining evaluation plots
Apply the train/test volunteer split suffix to the fusion confusion
matrices and transition accuracy plots, and to the standalone and
windowed transition accuracy plots, so they match the naming used for
the IMU/MMG confusion matrices. Files are renamed in place; contents
are unchanged.
</commit_message>
<xml_diff>
--- a/Results_to_be_shown.docx
+++ b/Results_to_be_shown.docx
@@ -22,10 +22,14 @@
           <w:ilvl w:val="0"/>
           <w:numId w:val="1"/>
         </w:numPr>
-        <w:rPr/>
-      </w:pPr>
-      <w:r>
-        <w:rPr/>
+        <w:rPr>
+          <w:color w:val="00A933"/>
+        </w:rPr>
+      </w:pPr>
+      <w:r>
+        <w:rPr>
+          <w:color w:val="00A933"/>
+        </w:rPr>
         <w:t>Individual volunteers</w:t>
       </w:r>
     </w:p>
@@ -126,10 +130,14 @@
           <w:ilvl w:val="1"/>
           <w:numId w:val="1"/>
         </w:numPr>
-        <w:rPr/>
-      </w:pPr>
-      <w:r>
-        <w:rPr/>
+        <w:rPr>
+          <w:color w:val="00A933"/>
+        </w:rPr>
+      </w:pPr>
+      <w:r>
+        <w:rPr>
+          <w:color w:val="00A933"/>
+        </w:rPr>
         <w:t>Predicting Intent</w:t>
       </w:r>
     </w:p>
@@ -140,10 +148,14 @@
           <w:ilvl w:val="2"/>
           <w:numId w:val="1"/>
         </w:numPr>
-        <w:rPr/>
-      </w:pPr>
-      <w:r>
-        <w:rPr/>
+        <w:rPr>
+          <w:color w:val="00A933"/>
+        </w:rPr>
+      </w:pPr>
+      <w:r>
+        <w:rPr>
+          <w:color w:val="00A933"/>
+        </w:rPr>
         <w:t>Average prediction graph IMU</w:t>
       </w:r>
     </w:p>
@@ -154,10 +166,14 @@
           <w:ilvl w:val="2"/>
           <w:numId w:val="1"/>
         </w:numPr>
-        <w:rPr/>
-      </w:pPr>
-      <w:r>
-        <w:rPr/>
+        <w:rPr>
+          <w:color w:val="00A933"/>
+        </w:rPr>
+      </w:pPr>
+      <w:r>
+        <w:rPr>
+          <w:color w:val="00A933"/>
+        </w:rPr>
         <w:t>Average prediction graph MMG</w:t>
       </w:r>
     </w:p>
@@ -169,12 +185,12 @@
           <w:numId w:val="1"/>
         </w:numPr>
         <w:rPr>
-          <w:color w:val="FF8000"/>
-        </w:rPr>
-      </w:pPr>
-      <w:r>
-        <w:rPr>
-          <w:color w:val="FF8000"/>
+          <w:color w:val="00A933"/>
+        </w:rPr>
+      </w:pPr>
+      <w:r>
+        <w:rPr>
+          <w:color w:val="00A933"/>
         </w:rPr>
         <w:t>Single Window vs Multi-Window</w:t>
       </w:r>
@@ -187,12 +203,12 @@
           <w:numId w:val="1"/>
         </w:numPr>
         <w:rPr>
-          <w:color w:val="FF8000"/>
-        </w:rPr>
-      </w:pPr>
-      <w:r>
-        <w:rPr>
-          <w:color w:val="FF8000"/>
+          <w:color w:val="00A933"/>
+        </w:rPr>
+      </w:pPr>
+      <w:r>
+        <w:rPr>
+          <w:color w:val="00A933"/>
         </w:rPr>
         <w:t>Say what was already shown</w:t>
       </w:r>
@@ -204,10 +220,14 @@
           <w:ilvl w:val="0"/>
           <w:numId w:val="1"/>
         </w:numPr>
-        <w:rPr/>
-      </w:pPr>
-      <w:r>
-        <w:rPr/>
+        <w:rPr>
+          <w:color w:val="00A933"/>
+        </w:rPr>
+      </w:pPr>
+      <w:r>
+        <w:rPr>
+          <w:color w:val="00A933"/>
+        </w:rPr>
         <w:t>Multi-volunteer</w:t>
       </w:r>
     </w:p>
@@ -255,7 +275,7 @@
           <w:numId w:val="1"/>
         </w:numPr>
         <w:rPr>
-          <w:rFonts w:asciiTheme="minorHAnsi" w:cstheme="minorBidi" w:eastAsiaTheme="minorHAnsi" w:hAnsiTheme="minorHAnsi"/>
+          <w:rFonts w:ascii="Aptos" w:hAnsi="Aptos" w:eastAsia="Aptos" w:cs="" w:asciiTheme="minorHAnsi" w:cstheme="minorBidi" w:eastAsiaTheme="minorHAnsi" w:hAnsiTheme="minorHAnsi"/>
           <w:color w:val="00A933"/>
           <w:highlight w:val="none"/>
           <w:shd w:fill="auto" w:val="clear"/>
@@ -264,7 +284,7 @@
       </w:pPr>
       <w:r>
         <w:rPr>
-          <w:rFonts w:asciiTheme="minorHAnsi" w:cstheme="minorBidi" w:eastAsiaTheme="minorHAnsi" w:hAnsiTheme="minorHAnsi"/>
+          <w:rFonts w:eastAsia="Aptos" w:cs="" w:cstheme="minorBidi" w:eastAsiaTheme="minorHAnsi"/>
           <w:color w:val="00A933"/>
           <w:shd w:fill="auto" w:val="clear"/>
           <w14:ligatures w14:val="standardContextual"/>
@@ -280,7 +300,7 @@
           <w:numId w:val="1"/>
         </w:numPr>
         <w:rPr>
-          <w:rFonts w:asciiTheme="minorHAnsi" w:cstheme="minorBidi" w:eastAsiaTheme="minorHAnsi" w:hAnsiTheme="minorHAnsi"/>
+          <w:rFonts w:ascii="Aptos" w:hAnsi="Aptos" w:eastAsia="Aptos" w:cs="" w:asciiTheme="minorHAnsi" w:cstheme="minorBidi" w:eastAsiaTheme="minorHAnsi" w:hAnsiTheme="minorHAnsi"/>
           <w:color w:val="00A933"/>
           <w:highlight w:val="none"/>
           <w:shd w:fill="auto" w:val="clear"/>
@@ -289,7 +309,7 @@
       </w:pPr>
       <w:r>
         <w:rPr>
-          <w:rFonts w:asciiTheme="minorHAnsi" w:cstheme="minorBidi" w:eastAsiaTheme="minorHAnsi" w:hAnsiTheme="minorHAnsi"/>
+          <w:rFonts w:eastAsia="Aptos" w:cs="" w:cstheme="minorBidi" w:eastAsiaTheme="minorHAnsi"/>
           <w:color w:val="00A933"/>
           <w:shd w:fill="auto" w:val="clear"/>
           <w14:ligatures w14:val="standardContextual"/>
@@ -305,7 +325,7 @@
           <w:numId w:val="1"/>
         </w:numPr>
         <w:rPr>
-          <w:rFonts w:asciiTheme="minorHAnsi" w:cstheme="minorBidi" w:eastAsiaTheme="minorHAnsi" w:hAnsiTheme="minorHAnsi"/>
+          <w:rFonts w:ascii="Aptos" w:hAnsi="Aptos" w:eastAsia="Aptos" w:cs="" w:asciiTheme="minorHAnsi" w:cstheme="minorBidi" w:eastAsiaTheme="minorHAnsi" w:hAnsiTheme="minorHAnsi"/>
           <w:color w:val="00A933"/>
           <w:highlight w:val="none"/>
           <w:shd w:fill="auto" w:val="clear"/>
@@ -314,7 +334,7 @@
       </w:pPr>
       <w:r>
         <w:rPr>
-          <w:rFonts w:asciiTheme="minorHAnsi" w:cstheme="minorBidi" w:eastAsiaTheme="minorHAnsi" w:hAnsiTheme="minorHAnsi"/>
+          <w:rFonts w:eastAsia="Aptos" w:cs="" w:cstheme="minorBidi" w:eastAsiaTheme="minorHAnsi"/>
           <w:color w:val="00A933"/>
           <w:shd w:fill="auto" w:val="clear"/>
           <w14:ligatures w14:val="standardContextual"/>
@@ -329,10 +349,14 @@
           <w:ilvl w:val="1"/>
           <w:numId w:val="1"/>
         </w:numPr>
-        <w:rPr/>
-      </w:pPr>
-      <w:r>
-        <w:rPr/>
+        <w:rPr>
+          <w:color w:val="00A933"/>
+        </w:rPr>
+      </w:pPr>
+      <w:r>
+        <w:rPr>
+          <w:color w:val="00A933"/>
+        </w:rPr>
         <w:t>Predicting Intent</w:t>
       </w:r>
     </w:p>
@@ -343,10 +367,14 @@
           <w:ilvl w:val="2"/>
           <w:numId w:val="1"/>
         </w:numPr>
-        <w:rPr/>
-      </w:pPr>
-      <w:r>
-        <w:rPr/>
+        <w:rPr>
+          <w:color w:val="00A933"/>
+        </w:rPr>
+      </w:pPr>
+      <w:r>
+        <w:rPr>
+          <w:color w:val="00A933"/>
+        </w:rPr>
         <w:t>Average prediction graph IMU</w:t>
       </w:r>
     </w:p>
@@ -357,10 +385,14 @@
           <w:ilvl w:val="2"/>
           <w:numId w:val="1"/>
         </w:numPr>
-        <w:rPr/>
-      </w:pPr>
-      <w:r>
-        <w:rPr/>
+        <w:rPr>
+          <w:color w:val="00A933"/>
+        </w:rPr>
+      </w:pPr>
+      <w:r>
+        <w:rPr>
+          <w:color w:val="00A933"/>
+        </w:rPr>
         <w:t>Average prediction graph MMG</w:t>
       </w:r>
     </w:p>
@@ -372,12 +404,12 @@
           <w:numId w:val="1"/>
         </w:numPr>
         <w:rPr>
-          <w:color w:val="FF8000"/>
-        </w:rPr>
-      </w:pPr>
-      <w:r>
-        <w:rPr>
-          <w:color w:val="FF8000"/>
+          <w:color w:val="00A933"/>
+        </w:rPr>
+      </w:pPr>
+      <w:r>
+        <w:rPr>
+          <w:color w:val="00A933"/>
         </w:rPr>
         <w:t>Single Window vs Multi-Window</w:t>
       </w:r>
@@ -390,12 +422,12 @@
           <w:numId w:val="1"/>
         </w:numPr>
         <w:rPr>
-          <w:color w:val="FF8000"/>
-        </w:rPr>
-      </w:pPr>
-      <w:r>
-        <w:rPr>
-          <w:color w:val="FF8000"/>
+          <w:color w:val="00A933"/>
+        </w:rPr>
+      </w:pPr>
+      <w:r>
+        <w:rPr>
+          <w:color w:val="00A933"/>
         </w:rPr>
         <w:t>Say what was already shown</w:t>
       </w:r>
@@ -407,10 +439,14 @@
           <w:ilvl w:val="0"/>
           <w:numId w:val="1"/>
         </w:numPr>
-        <w:rPr/>
-      </w:pPr>
-      <w:r>
-        <w:rPr/>
+        <w:rPr>
+          <w:color w:val="00A933"/>
+        </w:rPr>
+      </w:pPr>
+      <w:r>
+        <w:rPr>
+          <w:color w:val="00A933"/>
+        </w:rPr>
         <w:t>Fusion Models</w:t>
       </w:r>
     </w:p>
@@ -475,10 +511,19 @@
           <w:ilvl w:val="1"/>
           <w:numId w:val="1"/>
         </w:numPr>
-        <w:rPr/>
-      </w:pPr>
-      <w:r>
-        <w:rPr/>
+        <w:rPr>
+          <w:rFonts w:asciiTheme="minorHAnsi" w:cstheme="minorBidi" w:eastAsiaTheme="minorHAnsi" w:hAnsiTheme="minorHAnsi"/>
+          <w:highlight w:val="none"/>
+          <w:shd w:fill="FFFF00" w:val="clear"/>
+          <w14:ligatures w14:val="standardContextual"/>
+        </w:rPr>
+      </w:pPr>
+      <w:r>
+        <w:rPr>
+          <w:rFonts w:asciiTheme="minorHAnsi" w:cstheme="minorBidi" w:eastAsiaTheme="minorHAnsi" w:hAnsiTheme="minorHAnsi"/>
+          <w:shd w:fill="FFFF00" w:val="clear"/>
+          <w14:ligatures w14:val="standardContextual"/>
+        </w:rPr>
         <w:t>Early vs Late Fusion</w:t>
       </w:r>
     </w:p>
@@ -489,10 +534,19 @@
           <w:ilvl w:val="2"/>
           <w:numId w:val="1"/>
         </w:numPr>
-        <w:rPr/>
-      </w:pPr>
-      <w:r>
-        <w:rPr/>
+        <w:rPr>
+          <w:rFonts w:asciiTheme="minorHAnsi" w:cstheme="minorBidi" w:eastAsiaTheme="minorHAnsi" w:hAnsiTheme="minorHAnsi"/>
+          <w:highlight w:val="none"/>
+          <w:shd w:fill="FFFF00" w:val="clear"/>
+          <w14:ligatures w14:val="standardContextual"/>
+        </w:rPr>
+      </w:pPr>
+      <w:r>
+        <w:rPr>
+          <w:rFonts w:asciiTheme="minorHAnsi" w:cstheme="minorBidi" w:eastAsiaTheme="minorHAnsi" w:hAnsiTheme="minorHAnsi"/>
+          <w:shd w:fill="FFFF00" w:val="clear"/>
+          <w14:ligatures w14:val="standardContextual"/>
+        </w:rPr>
         <w:t>Make a graph</w:t>
       </w:r>
     </w:p>
@@ -503,10 +557,14 @@
           <w:ilvl w:val="1"/>
           <w:numId w:val="1"/>
         </w:numPr>
-        <w:rPr/>
-      </w:pPr>
-      <w:r>
-        <w:rPr/>
+        <w:rPr>
+          <w:color w:val="00A933"/>
+        </w:rPr>
+      </w:pPr>
+      <w:r>
+        <w:rPr>
+          <w:color w:val="00A933"/>
+        </w:rPr>
         <w:t>Use of GRU models</w:t>
       </w:r>
     </w:p>
@@ -517,10 +575,14 @@
           <w:ilvl w:val="2"/>
           <w:numId w:val="1"/>
         </w:numPr>
-        <w:rPr/>
-      </w:pPr>
-      <w:r>
-        <w:rPr/>
+        <w:rPr>
+          <w:color w:val="00A933"/>
+        </w:rPr>
+      </w:pPr>
+      <w:r>
+        <w:rPr>
+          <w:color w:val="00A933"/>
+        </w:rPr>
         <w:t>Average confusion matrix IMU</w:t>
       </w:r>
     </w:p>
@@ -531,10 +593,14 @@
           <w:ilvl w:val="2"/>
           <w:numId w:val="1"/>
         </w:numPr>
-        <w:rPr/>
-      </w:pPr>
-      <w:r>
-        <w:rPr/>
+        <w:rPr>
+          <w:color w:val="00A933"/>
+        </w:rPr>
+      </w:pPr>
+      <w:r>
+        <w:rPr>
+          <w:color w:val="00A933"/>
+        </w:rPr>
         <w:t>Average confusion matrix MMG</w:t>
       </w:r>
     </w:p>
@@ -545,10 +611,14 @@
           <w:ilvl w:val="2"/>
           <w:numId w:val="1"/>
         </w:numPr>
-        <w:rPr/>
-      </w:pPr>
-      <w:r>
-        <w:rPr/>
+        <w:rPr>
+          <w:color w:val="00A933"/>
+        </w:rPr>
+      </w:pPr>
+      <w:r>
+        <w:rPr>
+          <w:color w:val="00A933"/>
+        </w:rPr>
         <w:t>Average prediction graph IMU</w:t>
       </w:r>
     </w:p>
@@ -561,10 +631,14 @@
         </w:numPr>
         <w:spacing w:before="0" w:after="160"/>
         <w:contextualSpacing/>
-        <w:rPr/>
-      </w:pPr>
-      <w:r>
-        <w:rPr/>
+        <w:rPr>
+          <w:color w:val="00A933"/>
+        </w:rPr>
+      </w:pPr>
+      <w:r>
+        <w:rPr>
+          <w:color w:val="00A933"/>
+        </w:rPr>
         <w:t>Average prediction graph MMG</w:t>
       </w:r>
     </w:p>

</xml_diff>